<commit_message>
Update COSII labs and include virtual environment
</commit_message>
<xml_diff>
--- a/Отчет_по_лабораторной_работе_1_Власов_РЕ.docx
+++ b/Отчет_по_лабораторной_работе_1_Власов_РЕ.docx
@@ -1229,26 +1229,16 @@
     <w:p>
       <w:pPr>
         <w:jc w:val="center"/>
+        <w:rPr>
+          <w:lang w:val="en-US"/>
+        </w:rPr>
       </w:pPr>
       <w:r>
         <w:rPr>
           <w:rFonts w:eastAsia="Times New Roman" w:cs="Times New Roman"/>
-        </w:rPr>
-        <w:t xml:space="preserve">a[k] = x[k] + </w:t>
-      </w:r>
-      <w:proofErr w:type="gramStart"/>
-      <w:r>
-        <w:rPr>
-          <w:rFonts w:eastAsia="Times New Roman" w:cs="Times New Roman"/>
-        </w:rPr>
-        <w:t>x[</w:t>
-      </w:r>
-      <w:proofErr w:type="gramEnd"/>
-      <w:r>
-        <w:rPr>
-          <w:rFonts w:eastAsia="Times New Roman" w:cs="Times New Roman"/>
-        </w:rPr>
-        <w:t>k + N/2]</w:t>
+          <w:lang w:val="en-US"/>
+        </w:rPr>
+        <w:t>a[k] = x[k] + x[k + N/2]</w:t>
       </w:r>
     </w:p>
     <w:p>
@@ -1506,6 +1496,7 @@
     </w:p>
     <w:p>
       <w:pPr>
+        <w:ind w:firstLine="708"/>
         <w:jc w:val="both"/>
       </w:pPr>
       <w:r>
@@ -10859,45 +10850,41 @@
     <w:p>
       <w:pPr>
         <w:pStyle w:val="CodeListing"/>
-      </w:pPr>
-      <w:r>
-        <w:rPr>
-          <w:rFonts w:eastAsia="Courier New" w:cs="Courier New"/>
-        </w:rPr>
-        <w:t xml:space="preserve">023      </w:t>
-      </w:r>
-      <w:proofErr w:type="spellStart"/>
-      <w:r>
-        <w:rPr>
-          <w:rFonts w:eastAsia="Courier New" w:cs="Courier New"/>
-        </w:rPr>
-        <w:t>return</w:t>
-      </w:r>
-      <w:proofErr w:type="spellEnd"/>
-      <w:r>
-        <w:rPr>
-          <w:rFonts w:eastAsia="Courier New" w:cs="Courier New"/>
-        </w:rPr>
-        <w:t xml:space="preserve"> </w:t>
-      </w:r>
-      <w:proofErr w:type="spellStart"/>
-      <w:proofErr w:type="gramStart"/>
-      <w:r>
-        <w:rPr>
-          <w:rFonts w:eastAsia="Courier New" w:cs="Courier New"/>
+        <w:rPr>
+          <w:lang w:val="en-US"/>
+        </w:rPr>
+      </w:pPr>
+      <w:r>
+        <w:rPr>
+          <w:rFonts w:eastAsia="Courier New" w:cs="Courier New"/>
+          <w:lang w:val="en-US"/>
+        </w:rPr>
+        <w:t xml:space="preserve">023      return </w:t>
+      </w:r>
+      <w:proofErr w:type="gramStart"/>
+      <w:r>
+        <w:rPr>
+          <w:rFonts w:eastAsia="Courier New" w:cs="Courier New"/>
+          <w:lang w:val="en-US"/>
         </w:rPr>
         <w:t>np.fft.ifft</w:t>
       </w:r>
-      <w:proofErr w:type="spellEnd"/>
-      <w:proofErr w:type="gramEnd"/>
-      <w:r>
-        <w:rPr>
-          <w:rFonts w:eastAsia="Courier New" w:cs="Courier New"/>
+      <w:proofErr w:type="gramEnd"/>
+      <w:r>
+        <w:rPr>
+          <w:rFonts w:eastAsia="Courier New" w:cs="Courier New"/>
+          <w:lang w:val="en-US"/>
         </w:rPr>
         <w:t>(x)</w:t>
       </w:r>
     </w:p>
-    <w:p/>
+    <w:p>
+      <w:pPr>
+        <w:rPr>
+          <w:lang w:val="en-US"/>
+        </w:rPr>
+      </w:pPr>
+    </w:p>
     <w:p>
       <w:pPr>
         <w:spacing w:after="120"/>
@@ -18316,14 +18303,10 @@
     <w:p>
       <w:pPr>
         <w:pStyle w:val="CodeListing"/>
-        <w:rPr>
-          <w:lang w:val="en-US"/>
-        </w:rPr>
-      </w:pPr>
-      <w:r>
-        <w:rPr>
-          <w:rFonts w:eastAsia="Courier New" w:cs="Courier New"/>
-          <w:lang w:val="en-US"/>
+      </w:pPr>
+      <w:r>
+        <w:rPr>
+          <w:rFonts w:eastAsia="Courier New" w:cs="Courier New"/>
         </w:rPr>
         <w:t xml:space="preserve">123      </w:t>
       </w:r>
@@ -18339,7 +18322,6 @@
       <w:r>
         <w:rPr>
           <w:rFonts w:eastAsia="Courier New" w:cs="Courier New"/>
-          <w:lang w:val="en-US"/>
         </w:rPr>
         <w:t xml:space="preserve">: </w:t>
       </w:r>
@@ -18353,7 +18335,6 @@
       <w:r>
         <w:rPr>
           <w:rFonts w:eastAsia="Courier New" w:cs="Courier New"/>
-          <w:lang w:val="en-US"/>
         </w:rPr>
         <w:t>,</w:t>
       </w:r>
@@ -19114,6 +19095,9 @@
     <w:p>
       <w:pPr>
         <w:pStyle w:val="CodeListing"/>
+        <w:rPr>
+          <w:lang w:val="en-US"/>
+        </w:rPr>
       </w:pPr>
       <w:r>
         <w:rPr>
@@ -22531,6 +22515,9 @@
     <w:p>
       <w:pPr>
         <w:pStyle w:val="CodeListing"/>
+        <w:rPr>
+          <w:lang w:val="en-US"/>
+        </w:rPr>
       </w:pPr>
       <w:r>
         <w:rPr>
@@ -23047,18 +23034,13 @@
     <w:p>
       <w:pPr>
         <w:pStyle w:val="CodeListing"/>
-        <w:rPr>
-          <w:lang w:val="en-US"/>
-        </w:rPr>
-      </w:pPr>
-      <w:r>
-        <w:rPr>
-          <w:rFonts w:eastAsia="Courier New" w:cs="Courier New"/>
-          <w:lang w:val="en-US"/>
+      </w:pPr>
+      <w:r>
+        <w:rPr>
+          <w:rFonts w:eastAsia="Courier New" w:cs="Courier New"/>
         </w:rPr>
         <w:t xml:space="preserve">102          </w:t>
       </w:r>
-      <w:proofErr w:type="gramStart"/>
       <w:r>
         <w:rPr>
           <w:rFonts w:eastAsia="Courier New" w:cs="Courier New"/>
@@ -23066,11 +23048,9 @@
         </w:rPr>
         <w:t>OUTPUT</w:t>
       </w:r>
-      <w:proofErr w:type="gramEnd"/>
-      <w:r>
-        <w:rPr>
-          <w:rFonts w:eastAsia="Courier New" w:cs="Courier New"/>
-          <w:lang w:val="en-US"/>
+      <w:r>
+        <w:rPr>
+          <w:rFonts w:eastAsia="Courier New" w:cs="Courier New"/>
         </w:rPr>
         <w:t xml:space="preserve"> / "</w:t>
       </w:r>
@@ -23083,7 +23063,6 @@
       <w:r>
         <w:rPr>
           <w:rFonts w:eastAsia="Courier New" w:cs="Courier New"/>
-          <w:lang w:val="en-US"/>
         </w:rPr>
         <w:t>_</w:t>
       </w:r>
@@ -23097,10 +23076,10 @@
       <w:r>
         <w:rPr>
           <w:rFonts w:eastAsia="Courier New" w:cs="Courier New"/>
-          <w:lang w:val="en-US"/>
         </w:rPr>
         <w:t>_</w:t>
       </w:r>
+      <w:proofErr w:type="spellStart"/>
       <w:r>
         <w:rPr>
           <w:rFonts w:eastAsia="Courier New" w:cs="Courier New"/>
@@ -23110,7 +23089,6 @@
       <w:r>
         <w:rPr>
           <w:rFonts w:eastAsia="Courier New" w:cs="Courier New"/>
-          <w:lang w:val="en-US"/>
         </w:rPr>
         <w:t>_</w:t>
       </w:r>
@@ -23120,10 +23098,10 @@
         </w:rPr>
         <w:t>область</w:t>
       </w:r>
-      <w:r>
-        <w:rPr>
-          <w:rFonts w:eastAsia="Courier New" w:cs="Courier New"/>
-          <w:lang w:val="en-US"/>
+      <w:proofErr w:type="spellEnd"/>
+      <w:r>
+        <w:rPr>
+          <w:rFonts w:eastAsia="Courier New" w:cs="Courier New"/>
         </w:rPr>
         <w:t>.</w:t>
       </w:r>
@@ -23139,7 +23117,6 @@
       <w:r>
         <w:rPr>
           <w:rFonts w:eastAsia="Courier New" w:cs="Courier New"/>
-          <w:lang w:val="en-US"/>
         </w:rPr>
         <w:t>",</w:t>
       </w:r>
@@ -23327,18 +23304,13 @@
     <w:p>
       <w:pPr>
         <w:pStyle w:val="CodeListing"/>
-        <w:rPr>
-          <w:lang w:val="en-US"/>
-        </w:rPr>
-      </w:pPr>
-      <w:r>
-        <w:rPr>
-          <w:rFonts w:eastAsia="Courier New" w:cs="Courier New"/>
-          <w:lang w:val="en-US"/>
+      </w:pPr>
+      <w:r>
+        <w:rPr>
+          <w:rFonts w:eastAsia="Courier New" w:cs="Courier New"/>
         </w:rPr>
         <w:t xml:space="preserve">109          </w:t>
       </w:r>
-      <w:proofErr w:type="gramStart"/>
       <w:r>
         <w:rPr>
           <w:rFonts w:eastAsia="Courier New" w:cs="Courier New"/>
@@ -23346,14 +23318,13 @@
         </w:rPr>
         <w:t>OUTPUT</w:t>
       </w:r>
-      <w:proofErr w:type="gramEnd"/>
-      <w:r>
-        <w:rPr>
-          <w:rFonts w:eastAsia="Courier New" w:cs="Courier New"/>
-          <w:lang w:val="en-US"/>
+      <w:r>
+        <w:rPr>
+          <w:rFonts w:eastAsia="Courier New" w:cs="Courier New"/>
         </w:rPr>
         <w:t xml:space="preserve"> / "</w:t>
       </w:r>
+      <w:proofErr w:type="spellStart"/>
       <w:r>
         <w:rPr>
           <w:rFonts w:eastAsia="Courier New" w:cs="Courier New"/>
@@ -23363,7 +23334,6 @@
       <w:r>
         <w:rPr>
           <w:rFonts w:eastAsia="Courier New" w:cs="Courier New"/>
-          <w:lang w:val="en-US"/>
         </w:rPr>
         <w:t>_</w:t>
       </w:r>
@@ -23376,7 +23346,6 @@
       <w:r>
         <w:rPr>
           <w:rFonts w:eastAsia="Courier New" w:cs="Courier New"/>
-          <w:lang w:val="en-US"/>
         </w:rPr>
         <w:t>_</w:t>
       </w:r>
@@ -23389,7 +23358,6 @@
       <w:r>
         <w:rPr>
           <w:rFonts w:eastAsia="Courier New" w:cs="Courier New"/>
-          <w:lang w:val="en-US"/>
         </w:rPr>
         <w:t>_</w:t>
       </w:r>
@@ -23399,10 +23367,10 @@
         </w:rPr>
         <w:t>область</w:t>
       </w:r>
-      <w:r>
-        <w:rPr>
-          <w:rFonts w:eastAsia="Courier New" w:cs="Courier New"/>
-          <w:lang w:val="en-US"/>
+      <w:proofErr w:type="spellEnd"/>
+      <w:r>
+        <w:rPr>
+          <w:rFonts w:eastAsia="Courier New" w:cs="Courier New"/>
         </w:rPr>
         <w:t>.</w:t>
       </w:r>
@@ -23418,7 +23386,6 @@
       <w:r>
         <w:rPr>
           <w:rFonts w:eastAsia="Courier New" w:cs="Courier New"/>
-          <w:lang w:val="en-US"/>
         </w:rPr>
         <w:t>",</w:t>
       </w:r>
@@ -23657,18 +23624,13 @@
     <w:p>
       <w:pPr>
         <w:pStyle w:val="CodeListing"/>
-        <w:rPr>
-          <w:lang w:val="en-US"/>
-        </w:rPr>
-      </w:pPr>
-      <w:r>
-        <w:rPr>
-          <w:rFonts w:eastAsia="Courier New" w:cs="Courier New"/>
-          <w:lang w:val="en-US"/>
+      </w:pPr>
+      <w:r>
+        <w:rPr>
+          <w:rFonts w:eastAsia="Courier New" w:cs="Courier New"/>
         </w:rPr>
         <w:t xml:space="preserve">117          </w:t>
       </w:r>
-      <w:proofErr w:type="gramStart"/>
       <w:r>
         <w:rPr>
           <w:rFonts w:eastAsia="Courier New" w:cs="Courier New"/>
@@ -23676,14 +23638,13 @@
         </w:rPr>
         <w:t>OUTPUT</w:t>
       </w:r>
-      <w:proofErr w:type="gramEnd"/>
-      <w:r>
-        <w:rPr>
-          <w:rFonts w:eastAsia="Courier New" w:cs="Courier New"/>
-          <w:lang w:val="en-US"/>
+      <w:r>
+        <w:rPr>
+          <w:rFonts w:eastAsia="Courier New" w:cs="Courier New"/>
         </w:rPr>
         <w:t xml:space="preserve"> / "</w:t>
       </w:r>
+      <w:proofErr w:type="spellStart"/>
       <w:r>
         <w:rPr>
           <w:rFonts w:eastAsia="Courier New" w:cs="Courier New"/>
@@ -23693,7 +23654,6 @@
       <w:r>
         <w:rPr>
           <w:rFonts w:eastAsia="Courier New" w:cs="Courier New"/>
-          <w:lang w:val="en-US"/>
         </w:rPr>
         <w:t>_</w:t>
       </w:r>
@@ -23706,7 +23666,6 @@
       <w:r>
         <w:rPr>
           <w:rFonts w:eastAsia="Courier New" w:cs="Courier New"/>
-          <w:lang w:val="en-US"/>
         </w:rPr>
         <w:t>_</w:t>
       </w:r>
@@ -23716,10 +23675,10 @@
         </w:rPr>
         <w:t>сдвиг</w:t>
       </w:r>
-      <w:r>
-        <w:rPr>
-          <w:rFonts w:eastAsia="Courier New" w:cs="Courier New"/>
-          <w:lang w:val="en-US"/>
+      <w:proofErr w:type="spellEnd"/>
+      <w:r>
+        <w:rPr>
+          <w:rFonts w:eastAsia="Courier New" w:cs="Courier New"/>
         </w:rPr>
         <w:t>.</w:t>
       </w:r>
@@ -23735,7 +23694,6 @@
       <w:r>
         <w:rPr>
           <w:rFonts w:eastAsia="Courier New" w:cs="Courier New"/>
-          <w:lang w:val="en-US"/>
         </w:rPr>
         <w:t>",</w:t>
       </w:r>
@@ -24061,6 +24019,9 @@
     <w:p>
       <w:pPr>
         <w:pStyle w:val="CodeListing"/>
+        <w:rPr>
+          <w:lang w:val="en-US"/>
+        </w:rPr>
       </w:pPr>
       <w:r>
         <w:rPr>
@@ -27005,6 +26966,9 @@
     <w:p>
       <w:pPr>
         <w:pStyle w:val="CodeListing"/>
+        <w:rPr>
+          <w:lang w:val="en-US"/>
+        </w:rPr>
       </w:pPr>
       <w:r>
         <w:rPr>
@@ -27026,6 +26990,9 @@
     <w:p>
       <w:pPr>
         <w:pStyle w:val="CodeListing"/>
+        <w:rPr>
+          <w:lang w:val="en-US"/>
+        </w:rPr>
       </w:pPr>
       <w:r>
         <w:rPr>

</xml_diff>